<commit_message>
Images réduites dans les documents
</commit_message>
<xml_diff>
--- a/_support/supports_par_modules/Couleur/Support_FX.docx
+++ b/_support/supports_par_modules/Couleur/Support_FX.docx
@@ -2792,7 +2792,7 @@
       <w:r>
         <w:drawing>
           <wp:inline distT="0" distB="0" distL="0" distR="0">
-            <wp:extent cx="2524125" cy="1666875"/>
+            <wp:extent cx="2375296" cy="1568592"/>
             <wp:effectExtent t="0" r="0" b="0" l="0"/>
             <wp:docPr id="1" name="capture" descr="Quelques contrôles : un TextField, un Button, une CheckBox et un Slider" title="capture"/>
             <wp:cNvGraphicFramePr>
@@ -2817,7 +2817,7 @@
                   <pic:spPr bwMode="auto">
                     <a:xfrm>
                       <a:off x="0" y="0"/>
-                      <a:ext cx="2524125" cy="1666875"/>
+                      <a:ext cx="2375296" cy="1568592"/>
                     </a:xfrm>
                     <a:prstGeom prst="rect">
                       <a:avLst/>

</xml_diff>